<commit_message>
feat: refocus dashboard on factors and actionable risk insights
</commit_message>
<xml_diff>
--- a/report/TTDLTQ_report_draft.docx
+++ b/report/TTDLTQ_report_draft.docx
@@ -122,7 +122,7 @@
         <w:jc w:val="both"/>
       </w:pPr>
       <w:r>
-        <w:t>EDA cho thấy tỷ lệ duy trì sau năm đầu có liên hệ cùng chiều mạnh nhất trong nhóm biến đã xét; dữ liệu nhóm Pell Grant cho thấy một khoảng cách hoàn thành đáng kể. Dashboard ba trang dẫn người dùng từ bản đồ toàn quốc đến yếu tố liên quan và danh sách cảnh báo.</w:t>
+        <w:t>EDA cho thấy tỷ lệ duy trì sau năm đầu có liên hệ cùng chiều mạnh nhất trong nhóm biến đã xét; dữ liệu nhóm Pell Grant cho thấy một khoảng cách hoàn thành đáng kể. Dashboard ba trang dẫn người dùng từ bản đồ toàn quốc đến yếu tố liên quan và các nhóm cần ưu tiên kiểm tra.</w:t>
       </w:r>
     </w:p>
     <w:p>
@@ -130,7 +130,7 @@
         <w:jc w:val="both"/>
       </w:pPr>
       <w:r>
-        <w:t>Logistic Regression được đánh giá trên năm 2022 chưa dùng để train, đạt Accuracy 81.55%, Balanced Accuracy 80.11% và ROC-AUC 0.874. Kết quả vượt ngưỡng Accuracy 80% nhưng Recall 76.77% cho thấy vẫn có trường hợp rủi ro bị bỏ sót.</w:t>
+        <w:t>Hai kịch bản Logistic Regression được đánh giá trên năm 2022 chưa dùng để train. Mô hình điều kiện nền tảng đạt Accuracy 80.09%; mô hình bổ sung thông tin tiếp tục học sau năm nhất đạt Accuracy 81.34% và ROC-AUC 0.877. Cả hai vượt ngưỡng Accuracy 80%.</w:t>
       </w:r>
     </w:p>
     <w:p>
@@ -3250,7 +3250,7 @@
         <w:jc w:val="both"/>
       </w:pPr>
       <w:r>
-        <w:t>Khoảng cách địa lý là tín hiệu để drill-down, không phải ước lượng tác động của bang.</w:t>
+        <w:t>Vermont đạt 66.1%, cao hơn Alaska ở mức 36.9%. Bang kết quả cao có retention 78.1% và tỷ lệ giảng viên toàn thời gian 85.1%; bang kết quả thấp lần lượt đạt 72.1% và 49.7%.</w:t>
       </w:r>
     </w:p>
     <w:p>
@@ -3627,7 +3627,7 @@
               <w:rPr>
                 <w:sz w:val="18"/>
               </w:rPr>
-              <w:t>Duy trì năm đầu</w:t>
+              <w:t>Tiếp tục học sau năm nhất</w:t>
             </w:r>
           </w:p>
         </w:tc>
@@ -3715,7 +3715,7 @@
               <w:rPr>
                 <w:sz w:val="18"/>
               </w:rPr>
-              <w:t>Chi phí ròng</w:t>
+              <w:t>Chi phí thực trả sau hỗ trợ</w:t>
             </w:r>
           </w:p>
         </w:tc>
@@ -3759,7 +3759,7 @@
               <w:rPr>
                 <w:sz w:val="18"/>
               </w:rPr>
-              <w:t>Tỷ lệ GV toàn thời gian</w:t>
+              <w:t>Giảng viên làm việc toàn thời gian</w:t>
             </w:r>
           </w:p>
         </w:tc>
@@ -3803,7 +3803,7 @@
               <w:rPr>
                 <w:sz w:val="18"/>
               </w:rPr>
-              <w:t>Tỷ lệ vay liên bang</w:t>
+              <w:t>Sinh viên sử dụng khoản vay liên bang</w:t>
             </w:r>
           </w:p>
         </w:tc>
@@ -3847,7 +3847,7 @@
               <w:rPr>
                 <w:sz w:val="18"/>
               </w:rPr>
-              <w:t>Chi giảng dạy/SV</w:t>
+              <w:t>Chi cho giảng dạy trên mỗi sinh viên</w:t>
             </w:r>
           </w:p>
         </w:tc>
@@ -3891,7 +3891,7 @@
               <w:rPr>
                 <w:sz w:val="18"/>
               </w:rPr>
-              <w:t>Tỷ lệ nhận Pell Grant</w:t>
+              <w:t>Sinh viên cần hỗ trợ tài chính</w:t>
             </w:r>
           </w:p>
         </w:tc>
@@ -3935,7 +3935,7 @@
               <w:rPr>
                 <w:sz w:val="18"/>
               </w:rPr>
-              <w:t>Sinh viên/giảng viên</w:t>
+              <w:t>Số sinh viên trên một giảng viên</w:t>
             </w:r>
           </w:p>
         </w:tc>
@@ -3979,7 +3979,7 @@
               <w:rPr>
                 <w:sz w:val="18"/>
               </w:rPr>
-              <w:t>Quy mô (log)</w:t>
+              <w:t>Quy mô sinh viên</w:t>
             </w:r>
           </w:p>
         </w:tc>
@@ -4039,7 +4039,7 @@
         <w:jc w:val="both"/>
       </w:pPr>
       <w:r>
-        <w:t>Dashboard gồm ba trang theo đúng mạch story: bức tranh toàn quốc, tác nhân/khoảng cách và cảnh báo sớm. Màu đỏ dành cho rủi ro; xanh lá cho kết quả tốt; các màu trung tính cho nhóm so sánh.</w:t>
+        <w:t>Dashboard gồm ba trang theo đúng mạch story: khác biệt kết quả, các yếu tố liên quan và khả năng dự báo khi kết hợp yếu tố. Màu đỏ dành cho rủi ro; xanh lá cho kết quả tốt; các màu trung tính cho nhóm so sánh.</w:t>
       </w:r>
     </w:p>
     <w:p>
@@ -4060,7 +4060,7 @@
         <w:jc w:val="both"/>
       </w:pPr>
       <w:r>
-        <w:t>KPI, choropleth, xếp hạng bang, 100% stacked bar và point map. Người dùng lọc từ toàn quốc xuống bang và cơ sở.</w:t>
+        <w:t>KPI, choropleth, so sánh bang, khu vực sống và cơ cấu theo bậc đào tạo. Ngay dưới bản đồ là bảng giải thích chênh lệch bằng retention, giảng viên toàn thời gian, nhu cầu tài chính, cơ cấu bậc đào tạo và mức nông thôn/thị trấn.</w:t>
       </w:r>
     </w:p>
     <w:p>
@@ -4089,7 +4089,7 @@
         <w:jc w:val="both"/>
       </w:pPr>
       <w:r>
-        <w:t>Choropleth dùng mã bang và tỷ lệ completion có trọng số. Point map dùng tọa độ từng cơ sở. Tooltip cung cấp tên, quy mô, retention và completion.</w:t>
+        <w:t>Choropleth dùng mã bang và tỷ lệ completion có trọng số. So sánh Alaska–Vermont cho thấy retention chênh +6.0%, giảng viên toàn thời gian chênh +35.4% và cơ cấu cử nhân chênh +16.2%.</w:t>
       </w:r>
     </w:p>
     <w:p>
@@ -4110,7 +4110,7 @@
         <w:pStyle w:val="Heading2"/>
       </w:pPr>
       <w:r>
-        <w:t>5.3 Trang tác nhân</w:t>
+        <w:t>5.3 Trang yếu tố</w:t>
       </w:r>
     </w:p>
     <w:p>
@@ -4118,7 +4118,7 @@
         <w:jc w:val="both"/>
       </w:pPr>
       <w:r>
-        <w:t>Scatter + trend, box plot, heatmap, grouped bar, biểu đồ kết hợp và treemap trả lời yếu tố nào đi cùng kết quả và khoảng cách nhóm.</w:t>
+        <w:t>Biểu đồ bốn mức, scatter hệ số, heatmap, grouped bar và biểu đồ kết hợp trả lời yếu tố nào đi cùng kết quả và khoảng cách nhóm.</w:t>
       </w:r>
     </w:p>
     <w:p>
@@ -4147,7 +4147,7 @@
         <w:jc w:val="both"/>
       </w:pPr>
       <w:r>
-        <w:t>Gauge, donut, confusion matrix, feature importance và action list tích hợp xác suất dự báo vào dashboard.</w:t>
+        <w:t>KPI dự báo, so sánh hai kịch bản, gauge, donut, confusion matrix, feature importance, ma trận tiếp tục học–nguồn lực và rủi ro tổng hợp theo nhóm; không xếp hạng từng trường.</w:t>
       </w:r>
     </w:p>
     <w:p>
@@ -4205,7 +4205,7 @@
         <w:jc w:val="both"/>
       </w:pPr>
       <w:r>
-        <w:t>Luồng drill-down từ toàn quốc đến bang rồi cơ sở; từ bậc văn bằng đến ngành. Các KPI và chart được tính lại trên ngữ cảnh lọc.</w:t>
+        <w:t>Luồng drill-down bằng bộ lọc từ toàn quốc đến bang rồi loại hình/bậc đào tạo. Các KPI và chart được tính lại trên ngữ cảnh lọc.</w:t>
       </w:r>
     </w:p>
     <w:p>
@@ -4263,7 +4263,7 @@
         <w:jc w:val="both"/>
       </w:pPr>
       <w:r>
-        <w:t>Map trả lời ở đâu; bar trả lời xếp hạng/cơ cấu; scatter trả lời liên hệ; box trả lời phân bố; heatmap trả lời cường độ; treemap trả lời cơ cấu phân cấp; gauge/table phục vụ hành động.</w:t>
+        <w:t>Map trả lời ở đâu; bar trả lời cơ cấu; line bốn mức cho thấy chiều thay đổi; scatter trả lời độ mạnh liên hệ; heatmap trả lời tương tác; gauge và confusion matrix giải thích dự báo.</w:t>
       </w:r>
     </w:p>
     <w:p>
@@ -4313,7 +4313,7 @@
         <w:pStyle w:val="Heading2"/>
       </w:pPr>
       <w:r>
-        <w:t>5.10 Danh mục 14 loại hiển thị</w:t>
+        <w:t>5.10 Danh mục các loại hiển thị</w:t>
       </w:r>
     </w:p>
     <w:tbl>
@@ -4447,7 +4447,7 @@
               <w:rPr>
                 <w:sz w:val="18"/>
               </w:rPr>
-              <w:t>Scatter geo</w:t>
+              <w:t>Horizontal bar</w:t>
             </w:r>
           </w:p>
         </w:tc>
@@ -4461,7 +4461,7 @@
               <w:rPr>
                 <w:sz w:val="18"/>
               </w:rPr>
-              <w:t>Điểm từng cơ sở</w:t>
+              <w:t>So sánh bang và nhóm</w:t>
             </w:r>
           </w:p>
         </w:tc>
@@ -4478,50 +4478,6 @@
                 <w:sz w:val="18"/>
               </w:rPr>
               <w:t>3</w:t>
-            </w:r>
-          </w:p>
-        </w:tc>
-        <w:tc>
-          <w:tcPr>
-            <w:tcW w:type="dxa" w:w="3081"/>
-            <w:vAlign w:val="center"/>
-          </w:tcPr>
-          <w:p>
-            <w:r>
-              <w:rPr>
-                <w:sz w:val="18"/>
-              </w:rPr>
-              <w:t>Horizontal bar</w:t>
-            </w:r>
-          </w:p>
-        </w:tc>
-        <w:tc>
-          <w:tcPr>
-            <w:tcW w:type="dxa" w:w="3081"/>
-            <w:vAlign w:val="center"/>
-          </w:tcPr>
-          <w:p>
-            <w:r>
-              <w:rPr>
-                <w:sz w:val="18"/>
-              </w:rPr>
-              <w:t>Xếp hạng bang</w:t>
-            </w:r>
-          </w:p>
-        </w:tc>
-      </w:tr>
-      <w:tr>
-        <w:tc>
-          <w:tcPr>
-            <w:tcW w:type="dxa" w:w="3081"/>
-            <w:vAlign w:val="center"/>
-          </w:tcPr>
-          <w:p>
-            <w:r>
-              <w:rPr>
-                <w:sz w:val="18"/>
-              </w:rPr>
-              <w:t>4</w:t>
             </w:r>
           </w:p>
         </w:tc>
@@ -4565,6 +4521,50 @@
               <w:rPr>
                 <w:sz w:val="18"/>
               </w:rPr>
+              <w:t>4</w:t>
+            </w:r>
+          </w:p>
+        </w:tc>
+        <w:tc>
+          <w:tcPr>
+            <w:tcW w:type="dxa" w:w="3081"/>
+            <w:vAlign w:val="center"/>
+          </w:tcPr>
+          <w:p>
+            <w:r>
+              <w:rPr>
+                <w:sz w:val="18"/>
+              </w:rPr>
+              <w:t>Scatter</w:t>
+            </w:r>
+          </w:p>
+        </w:tc>
+        <w:tc>
+          <w:tcPr>
+            <w:tcW w:type="dxa" w:w="3081"/>
+            <w:vAlign w:val="center"/>
+          </w:tcPr>
+          <w:p>
+            <w:r>
+              <w:rPr>
+                <w:sz w:val="18"/>
+              </w:rPr>
+              <w:t>Độ mạnh và chiều liên hệ</w:t>
+            </w:r>
+          </w:p>
+        </w:tc>
+      </w:tr>
+      <w:tr>
+        <w:tc>
+          <w:tcPr>
+            <w:tcW w:type="dxa" w:w="3081"/>
+            <w:vAlign w:val="center"/>
+          </w:tcPr>
+          <w:p>
+            <w:r>
+              <w:rPr>
+                <w:sz w:val="18"/>
+              </w:rPr>
               <w:t>5</w:t>
             </w:r>
           </w:p>
@@ -4579,7 +4579,7 @@
               <w:rPr>
                 <w:sz w:val="18"/>
               </w:rPr>
-              <w:t>Scatter + trend</w:t>
+              <w:t>Line chart</w:t>
             </w:r>
           </w:p>
         </w:tc>
@@ -4593,7 +4593,7 @@
               <w:rPr>
                 <w:sz w:val="18"/>
               </w:rPr>
-              <w:t>Liên hệ retention–completion</w:t>
+              <w:t>Kết quả qua bốn mức yếu tố</w:t>
             </w:r>
           </w:p>
         </w:tc>
@@ -4623,7 +4623,7 @@
               <w:rPr>
                 <w:sz w:val="18"/>
               </w:rPr>
-              <w:t>Box plot</w:t>
+              <w:t>Heatmap</w:t>
             </w:r>
           </w:p>
         </w:tc>
@@ -4637,7 +4637,7 @@
               <w:rPr>
                 <w:sz w:val="18"/>
               </w:rPr>
-              <w:t>Phân bố theo loại hình</w:t>
+              <w:t>Tương tác nhóm, confusion matrix và hồ sơ rủi ro</w:t>
             </w:r>
           </w:p>
         </w:tc>
@@ -4667,7 +4667,7 @@
               <w:rPr>
                 <w:sz w:val="18"/>
               </w:rPr>
-              <w:t>Heatmap</w:t>
+              <w:t>Grouped bar</w:t>
             </w:r>
           </w:p>
         </w:tc>
@@ -4681,7 +4681,7 @@
               <w:rPr>
                 <w:sz w:val="18"/>
               </w:rPr>
-              <w:t>Liên hệ và confusion matrix</w:t>
+              <w:t>Khoảng cách nhóm và so sánh mô hình</w:t>
             </w:r>
           </w:p>
         </w:tc>
@@ -4698,50 +4698,6 @@
                 <w:sz w:val="18"/>
               </w:rPr>
               <w:t>8</w:t>
-            </w:r>
-          </w:p>
-        </w:tc>
-        <w:tc>
-          <w:tcPr>
-            <w:tcW w:type="dxa" w:w="3081"/>
-            <w:vAlign w:val="center"/>
-          </w:tcPr>
-          <w:p>
-            <w:r>
-              <w:rPr>
-                <w:sz w:val="18"/>
-              </w:rPr>
-              <w:t>Grouped bar</w:t>
-            </w:r>
-          </w:p>
-        </w:tc>
-        <w:tc>
-          <w:tcPr>
-            <w:tcW w:type="dxa" w:w="3081"/>
-            <w:vAlign w:val="center"/>
-          </w:tcPr>
-          <w:p>
-            <w:r>
-              <w:rPr>
-                <w:sz w:val="18"/>
-              </w:rPr>
-              <w:t>Khoảng cách nhóm</w:t>
-            </w:r>
-          </w:p>
-        </w:tc>
-      </w:tr>
-      <w:tr>
-        <w:tc>
-          <w:tcPr>
-            <w:tcW w:type="dxa" w:w="3081"/>
-            <w:vAlign w:val="center"/>
-          </w:tcPr>
-          <w:p>
-            <w:r>
-              <w:rPr>
-                <w:sz w:val="18"/>
-              </w:rPr>
-              <w:t>9</w:t>
             </w:r>
           </w:p>
         </w:tc>
@@ -4785,51 +4741,7 @@
               <w:rPr>
                 <w:sz w:val="18"/>
               </w:rPr>
-              <w:t>10</w:t>
-            </w:r>
-          </w:p>
-        </w:tc>
-        <w:tc>
-          <w:tcPr>
-            <w:tcW w:type="dxa" w:w="3081"/>
-            <w:vAlign w:val="center"/>
-          </w:tcPr>
-          <w:p>
-            <w:r>
-              <w:rPr>
-                <w:sz w:val="18"/>
-              </w:rPr>
-              <w:t>Treemap</w:t>
-            </w:r>
-          </w:p>
-        </w:tc>
-        <w:tc>
-          <w:tcPr>
-            <w:tcW w:type="dxa" w:w="3081"/>
-            <w:vAlign w:val="center"/>
-          </w:tcPr>
-          <w:p>
-            <w:r>
-              <w:rPr>
-                <w:sz w:val="18"/>
-              </w:rPr>
-              <w:t>Ngành và bậc văn bằng</w:t>
-            </w:r>
-          </w:p>
-        </w:tc>
-      </w:tr>
-      <w:tr>
-        <w:tc>
-          <w:tcPr>
-            <w:tcW w:type="dxa" w:w="3081"/>
-            <w:vAlign w:val="center"/>
-          </w:tcPr>
-          <w:p>
-            <w:r>
-              <w:rPr>
-                <w:sz w:val="18"/>
-              </w:rPr>
-              <w:t>11</w:t>
+              <w:t>9</w:t>
             </w:r>
           </w:p>
         </w:tc>
@@ -4873,7 +4785,7 @@
               <w:rPr>
                 <w:sz w:val="18"/>
               </w:rPr>
-              <w:t>12</w:t>
+              <w:t>10</w:t>
             </w:r>
           </w:p>
         </w:tc>
@@ -4906,94 +4818,6 @@
           </w:p>
         </w:tc>
       </w:tr>
-      <w:tr>
-        <w:tc>
-          <w:tcPr>
-            <w:tcW w:type="dxa" w:w="3081"/>
-            <w:vAlign w:val="center"/>
-          </w:tcPr>
-          <w:p>
-            <w:r>
-              <w:rPr>
-                <w:sz w:val="18"/>
-              </w:rPr>
-              <w:t>13</w:t>
-            </w:r>
-          </w:p>
-        </w:tc>
-        <w:tc>
-          <w:tcPr>
-            <w:tcW w:type="dxa" w:w="3081"/>
-            <w:vAlign w:val="center"/>
-          </w:tcPr>
-          <w:p>
-            <w:r>
-              <w:rPr>
-                <w:sz w:val="18"/>
-              </w:rPr>
-              <w:t>Matrix</w:t>
-            </w:r>
-          </w:p>
-        </w:tc>
-        <w:tc>
-          <w:tcPr>
-            <w:tcW w:type="dxa" w:w="3081"/>
-            <w:vAlign w:val="center"/>
-          </w:tcPr>
-          <w:p>
-            <w:r>
-              <w:rPr>
-                <w:sz w:val="18"/>
-              </w:rPr>
-              <w:t>Thực tế–dự báo</w:t>
-            </w:r>
-          </w:p>
-        </w:tc>
-      </w:tr>
-      <w:tr>
-        <w:tc>
-          <w:tcPr>
-            <w:tcW w:type="dxa" w:w="3081"/>
-            <w:vAlign w:val="center"/>
-          </w:tcPr>
-          <w:p>
-            <w:r>
-              <w:rPr>
-                <w:sz w:val="18"/>
-              </w:rPr>
-              <w:t>14</w:t>
-            </w:r>
-          </w:p>
-        </w:tc>
-        <w:tc>
-          <w:tcPr>
-            <w:tcW w:type="dxa" w:w="3081"/>
-            <w:vAlign w:val="center"/>
-          </w:tcPr>
-          <w:p>
-            <w:r>
-              <w:rPr>
-                <w:sz w:val="18"/>
-              </w:rPr>
-              <w:t>Table + data bar</w:t>
-            </w:r>
-          </w:p>
-        </w:tc>
-        <w:tc>
-          <w:tcPr>
-            <w:tcW w:type="dxa" w:w="3081"/>
-            <w:vAlign w:val="center"/>
-          </w:tcPr>
-          <w:p>
-            <w:r>
-              <w:rPr>
-                <w:sz w:val="18"/>
-              </w:rPr>
-              <w:t>Danh sách ưu tiên</w:t>
-            </w:r>
-          </w:p>
-        </w:tc>
-      </w:tr>
     </w:tbl>
     <w:p>
       <w:r>
@@ -5071,7 +4895,7 @@
         <w:pStyle w:val="Heading2"/>
       </w:pPr>
       <w:r>
-        <w:t>6.2 Loại hình cơ sở đi cùng khoảng cách hoàn thành</w:t>
+        <w:t>6.2 Tiếp tục học sau năm nhất là yếu tố nổi bật nhất</w:t>
       </w:r>
     </w:p>
     <w:p>
@@ -5079,7 +4903,7 @@
         <w:jc w:val="both"/>
       </w:pPr>
       <w:r>
-        <w:t>Tỷ lệ hoàn thành có trọng số thấp nhất ở nhóm Tư thục vì lợi nhuận (48.5%) và cao nhất ở nhóm Tư thục phi lợi nhuận (64.0%).</w:t>
+        <w:t>Nhóm có tỷ lệ tiếp tục học sau năm nhất cao nhất có trung vị hoàn thành cao hơn nhóm thấp nhất 40.5%.</w:t>
       </w:r>
     </w:p>
     <w:p>
@@ -5087,7 +4911,7 @@
         <w:jc w:val="both"/>
       </w:pPr>
       <w:r>
-        <w:t>Câu hỏi liên quan: RQ1/RQ3.</w:t>
+        <w:t>Câu hỏi liên quan: RQ2/RQ3.</w:t>
       </w:r>
     </w:p>
     <w:p>
@@ -5095,7 +4919,7 @@
         <w:jc w:val="both"/>
       </w:pPr>
       <w:r>
-        <w:t>Giới hạn diễn giải: Không kiểm soát đầy đủ khác biệt đầu vào và sứ mệnh đào tạo giữa các nhóm trường.</w:t>
+        <w:t>Giới hạn diễn giải: Đây là liên hệ rất rõ nhưng vẫn không chứng minh việc tăng retention một cách cơ học sẽ trực tiếp tạo ra mức tăng tương ứng.</w:t>
       </w:r>
     </w:p>
     <w:p>
@@ -5116,7 +4940,7 @@
         <w:pStyle w:val="Heading2"/>
       </w:pPr>
       <w:r>
-        <w:t>6.3 Chỉ báo liên hệ mạnh nhất trong EDA</w:t>
+        <w:t>6.3 Lớp học đông hơn đi cùng tỷ lệ hoàn thành thấp hơn</w:t>
       </w:r>
     </w:p>
     <w:p>
@@ -5124,7 +4948,7 @@
         <w:jc w:val="both"/>
       </w:pPr>
       <w:r>
-        <w:t>Duy trì năm đầu có liên hệ cùng chiều mạnh nhất với tỷ lệ hoàn thành trong các biến đã xét (Spearman rho=0.57, N=4,858).</w:t>
+        <w:t>Từ nhóm có ít sinh viên/giảng viên nhất đến nhóm cao nhất, trung vị hoàn thành thay đổi -10.6%; hệ số liên hệ Spearman là -0.17.</w:t>
       </w:r>
     </w:p>
     <w:p>
@@ -5132,7 +4956,7 @@
         <w:jc w:val="both"/>
       </w:pPr>
       <w:r>
-        <w:t>Câu hỏi liên quan: RQ2/RQ3.</w:t>
+        <w:t>Câu hỏi liên quan: RQ3.</w:t>
       </w:r>
     </w:p>
     <w:p>
@@ -5140,7 +4964,7 @@
         <w:jc w:val="both"/>
       </w:pPr>
       <w:r>
-        <w:t>Giới hạn diễn giải: Hệ số tương quan không chứng minh quan hệ nhân quả và chưa kiểm soát đồng thời các biến khác.</w:t>
+        <w:t>Giới hạn diễn giải: Tỷ lệ sinh viên/giảng viên không phản ánh trực tiếp quy mô từng lớp và còn liên quan loại chương trình.</w:t>
       </w:r>
     </w:p>
     <w:p>
@@ -5161,7 +4985,7 @@
         <w:pStyle w:val="Heading2"/>
       </w:pPr>
       <w:r>
-        <w:t>6.4 Khoảng cách theo nhu cầu hỗ trợ tài chính</w:t>
+        <w:t>6.4 Khó khăn tài chính đi cùng khoảng cách hoàn thành</w:t>
       </w:r>
     </w:p>
     <w:p>
@@ -5169,7 +4993,7 @@
         <w:jc w:val="both"/>
       </w:pPr>
       <w:r>
-        <w:t>Nhóm không nhận Pell Grant có tỷ lệ hoàn thành ba năm cao hơn nhóm nhận Pell khoảng 12.7% trong dữ liệu có thể công bố.</w:t>
+        <w:t>Sinh viên không nhận Pell Grant có tỷ lệ hoàn thành sau ba năm cao hơn sinh viên nhận hỗ trợ này khoảng 12.7% trong dữ liệu có thể công bố.</w:t>
       </w:r>
     </w:p>
     <w:p>
@@ -5185,7 +5009,7 @@
         <w:jc w:val="both"/>
       </w:pPr>
       <w:r>
-        <w:t>Giới hạn diễn giải: Pell Grant là chỉ báo nhu cầu tài chính; dữ liệu Title IV và privacy suppression giới hạn tính đại diện.</w:t>
+        <w:t>Giới hạn diễn giải: Pell Grant là khoản hỗ trợ cho người có nhu cầu tài chính; nó phản ánh hoàn cảnh khó khăn chứ không phải nguyên nhân làm kết quả thấp.</w:t>
       </w:r>
     </w:p>
     <w:p>
@@ -5206,7 +5030,7 @@
         <w:pStyle w:val="Heading2"/>
       </w:pPr>
       <w:r>
-        <w:t>6.5 Bất lợi cộng dồn đi cùng kết quả thấp hơn</w:t>
+        <w:t>6.5 Nhiều điều kiện bất lợi cùng xuất hiện làm khoảng cách rõ hơn</w:t>
       </w:r>
     </w:p>
     <w:p>
@@ -5214,7 +5038,7 @@
         <w:jc w:val="both"/>
       </w:pPr>
       <w:r>
-        <w:t>Trung vị hoàn thành giảm từ 58.1% khi có 0 bất lợi xuống 51.1% khi có 4 bất lợi trong định nghĩa phân vị đã khóa.</w:t>
+        <w:t>Trung vị hoàn thành giảm từ 58.1% xuống 51.1% khi bốn điều kiện cùng bất lợi: nhu cầu hỗ trợ tài chính cao, chi phí cao, nhiều sinh viên/giảng viên và ít tiếp tục học sau năm nhất.</w:t>
       </w:r>
     </w:p>
     <w:p>
@@ -5230,7 +5054,7 @@
         <w:jc w:val="both"/>
       </w:pPr>
       <w:r>
-        <w:t>Giới hạn diễn giải: Chỉ số bất lợi là quy tắc mô tả dựa trên phân vị, không phải thang đo nhân quả.</w:t>
+        <w:t>Giới hạn diễn giải: Các điều kiện được xác định bằng phân vị để so sánh; đây không phải thang điểm đánh giá từng trường hay từng sinh viên.</w:t>
       </w:r>
     </w:p>
     <w:p>
@@ -5259,7 +5083,15 @@
         <w:jc w:val="both"/>
       </w:pPr>
       <w:r>
-        <w:t>Kết quả cho thấy completion là kết quả của nhiều bối cảnh đồng thời. Retention năm đầu là chỉ báo thực hành rõ nhất trong dữ liệu; Pell/first-generation cho thấy nhu cầu xem xét khoảng cách; loại hình và địa lý xác định nơi cần drill-down. Mô hình tổng hợp các biến thành xác suất để ưu tiên phân tích sâu.</w:t>
+        <w:t>Bản đồ mở đầu bằng khoảng cách Alaska–Vermont, sau đó giải thích bằng retention, đội ngũ giảng dạy và cơ cấu chương trình. Đáng chú ý, Vermont có tỷ trọng cơ sở nông thôn/thị trấn 68.8%, cao hơn mức 40.0% của Alaska; vì vậy mức độ hẻo lánh riêng lẻ không mô tả đúng khoảng cách quan sát.</w:t>
+      </w:r>
+    </w:p>
+    <w:p>
+      <w:pPr>
+        <w:jc w:val="both"/>
+      </w:pPr>
+      <w:r>
+        <w:t>Kết quả cho thấy completion đi cùng nhiều điều kiện đồng thời. Retention năm đầu là chỉ báo thực hành rõ nhất trong dữ liệu; Pell/first-generation cho thấy nhu cầu xem xét khoảng cách; nguồn lực và cơ cấu đào tạo giúp giải thích khác biệt địa lý. Mô hình tổng hợp các biến thành xác suất để ưu tiên phân tích sâu.</w:t>
       </w:r>
     </w:p>
     <w:p>
@@ -5322,7 +5154,7 @@
         <w:jc w:val="both"/>
       </w:pPr>
       <w:r>
-        <w:t>Feature gồm loại trường, bậc, locale, distance, enrollment, Pell, loan, student–faculty ratio, net price, tuition và retention. completion/target bị cấm.</w:t>
+        <w:t>Feature gồm hoàn cảnh tài chính, nguồn lực giảng dạy, loại hình, địa bàn, quy mô và mức tuyển chọn. Kịch bản sau năm nhất mới bổ sung retention. completion/target bị cấm.</w:t>
       </w:r>
     </w:p>
     <w:p>
@@ -5377,7 +5209,7 @@
         <w:pStyle w:val="Heading2"/>
       </w:pPr>
       <w:r>
-        <w:t>7.5 Hai cấu hình</w:t>
+        <w:t>7.5 Hai kịch bản</w:t>
       </w:r>
     </w:p>
     <w:p>
@@ -5385,7 +5217,7 @@
         <w:jc w:val="both"/>
       </w:pPr>
       <w:r>
-        <w:t>Baseline tối ưu accuracy tổng thể nhưng recall thấp. Balanced spline tăng cân bằng hai lớp và được chọn theo mục tiêu cảnh báo.</w:t>
+        <w:t>Mô hình nền tảng kiểm tra khả năng dự báo từ tài chính, nguồn lực và bối cảnh. Mô hình sau năm nhất bổ sung khả năng tiếp tục học để đo phần cải thiện.</w:t>
       </w:r>
     </w:p>
     <w:p>
@@ -5485,7 +5317,7 @@
                 <w:b/>
                 <w:sz w:val="18"/>
               </w:rPr>
-              <w:t>Baseline</w:t>
+              <w:t>Điều kiện nền tảng</w:t>
             </w:r>
           </w:p>
         </w:tc>
@@ -5500,7 +5332,7 @@
                 <w:b/>
                 <w:sz w:val="18"/>
               </w:rPr>
-              <w:t>Mô hình chọn</w:t>
+              <w:t>Bổ sung sau năm nhất</w:t>
             </w:r>
           </w:p>
         </w:tc>
@@ -5530,7 +5362,7 @@
               <w:rPr>
                 <w:sz w:val="18"/>
               </w:rPr>
-              <w:t>81.75%</w:t>
+              <w:t>80.09%</w:t>
             </w:r>
           </w:p>
         </w:tc>
@@ -5544,7 +5376,7 @@
               <w:rPr>
                 <w:sz w:val="18"/>
               </w:rPr>
-              <w:t>81.55%</w:t>
+              <w:t>81.34%</w:t>
             </w:r>
           </w:p>
         </w:tc>
@@ -5574,7 +5406,7 @@
               <w:rPr>
                 <w:sz w:val="18"/>
               </w:rPr>
-              <w:t>74.97%</w:t>
+              <w:t>78.54%</w:t>
             </w:r>
           </w:p>
         </w:tc>
@@ -5588,7 +5420,7 @@
               <w:rPr>
                 <w:sz w:val="18"/>
               </w:rPr>
-              <w:t>80.11%</w:t>
+              <w:t>79.86%</w:t>
             </w:r>
           </w:p>
         </w:tc>
@@ -5618,7 +5450,7 @@
               <w:rPr>
                 <w:sz w:val="18"/>
               </w:rPr>
-              <w:t>59.25%</w:t>
+              <w:t>74.93%</w:t>
             </w:r>
           </w:p>
         </w:tc>
@@ -5632,7 +5464,7 @@
               <w:rPr>
                 <w:sz w:val="18"/>
               </w:rPr>
-              <w:t>76.77%</w:t>
+              <w:t>76.44%</w:t>
             </w:r>
           </w:p>
         </w:tc>
@@ -5662,7 +5494,7 @@
               <w:rPr>
                 <w:sz w:val="18"/>
               </w:rPr>
-              <w:t>71.67%</w:t>
+              <w:t>62.51%</w:t>
             </w:r>
           </w:p>
         </w:tc>
@@ -5676,7 +5508,7 @@
               <w:rPr>
                 <w:sz w:val="18"/>
               </w:rPr>
-              <w:t>64.82%</w:t>
+              <w:t>64.51%</w:t>
             </w:r>
           </w:p>
         </w:tc>
@@ -5706,7 +5538,7 @@
               <w:rPr>
                 <w:sz w:val="18"/>
               </w:rPr>
-              <w:t>64.87%</w:t>
+              <w:t>68.16%</w:t>
             </w:r>
           </w:p>
         </w:tc>
@@ -5720,7 +5552,7 @@
               <w:rPr>
                 <w:sz w:val="18"/>
               </w:rPr>
-              <w:t>70.29%</w:t>
+              <w:t>69.97%</w:t>
             </w:r>
           </w:p>
         </w:tc>
@@ -5750,7 +5582,7 @@
               <w:rPr>
                 <w:sz w:val="18"/>
               </w:rPr>
-              <w:t>0.849</w:t>
+              <w:t>0.847</w:t>
             </w:r>
           </w:p>
         </w:tc>
@@ -5764,7 +5596,7 @@
               <w:rPr>
                 <w:sz w:val="18"/>
               </w:rPr>
-              <w:t>0.874</w:t>
+              <w:t>0.877</w:t>
             </w:r>
           </w:p>
         </w:tc>
@@ -5794,7 +5626,7 @@
               <w:rPr>
                 <w:sz w:val="18"/>
               </w:rPr>
-              <w:t>0.133</w:t>
+              <w:t>0.145</w:t>
             </w:r>
           </w:p>
         </w:tc>
@@ -5808,7 +5640,7 @@
               <w:rPr>
                 <w:sz w:val="18"/>
               </w:rPr>
-              <w:t>0.136</w:t>
+              <w:t>0.133</w:t>
             </w:r>
           </w:p>
         </w:tc>
@@ -5819,7 +5651,7 @@
         <w:jc w:val="both"/>
       </w:pPr>
       <w:r>
-        <w:t>Mô hình chọn qua cổng Accuracy 80%. Recall dưới 80% được công bố như giới hạn; ưu tiên balanced model vì giảm bỏ sót đáng kể so với baseline.</w:t>
+        <w:t>Cả hai kịch bản qua cổng Accuracy 80%. Việc thêm thông tin sau năm nhất làm khả năng dự báo tăng, qua đó kiểm chứng vai trò của khả năng tiếp tục học như một tín hiệu sớm.</w:t>
       </w:r>
     </w:p>
     <w:p>
@@ -5891,7 +5723,7 @@
         <w:jc w:val="both"/>
       </w:pPr>
       <w:r>
-        <w:t>Có 3.200 true negative, 635 false positive, 354 false negative và 1.170 true positive. False negative là trường hợp cần lưu ý trong cảnh báo sớm.</w:t>
+        <w:t>Có 3.194 true negative, 641 false positive, 359 false negative và 1.165 true positive. False negative là trường hợp cần lưu ý khi diễn giải mô hình.</w:t>
       </w:r>
     </w:p>
     <w:p>
@@ -5963,7 +5795,7 @@
         <w:jc w:val="both"/>
       </w:pPr>
       <w:r>
-        <w:t>ROC-AUC 0,874 cho thấy khả năng xếp hạng khá tốt. PR curve cần đọc cùng prevalence của lớp rủi ro và mục tiêu sử dụng.</w:t>
+        <w:t>ROC-AUC 0,877 cho thấy khả năng xếp hạng khá tốt. PR curve cần đọc cùng prevalence của lớp rủi ro và mục tiêu sử dụng.</w:t>
       </w:r>
     </w:p>
     <w:p>
@@ -6138,7 +5970,7 @@
               <w:rPr>
                 <w:sz w:val="18"/>
               </w:rPr>
-              <w:t>0.1346</w:t>
+              <w:t>0.0994</w:t>
             </w:r>
           </w:p>
         </w:tc>
@@ -6152,7 +5984,7 @@
               <w:rPr>
                 <w:sz w:val="18"/>
               </w:rPr>
-              <w:t>0.0060</w:t>
+              <w:t>0.0059</w:t>
             </w:r>
           </w:p>
         </w:tc>
@@ -6182,7 +6014,7 @@
               <w:rPr>
                 <w:sz w:val="18"/>
               </w:rPr>
-              <w:t>0.0745</w:t>
+              <w:t>0.0546</w:t>
             </w:r>
           </w:p>
         </w:tc>
@@ -6196,7 +6028,7 @@
               <w:rPr>
                 <w:sz w:val="18"/>
               </w:rPr>
-              <w:t>0.0054</w:t>
+              <w:t>0.0043</w:t>
             </w:r>
           </w:p>
         </w:tc>
@@ -6226,7 +6058,7 @@
               <w:rPr>
                 <w:sz w:val="18"/>
               </w:rPr>
-              <w:t>0.0629</w:t>
+              <w:t>0.0523</w:t>
             </w:r>
           </w:p>
         </w:tc>
@@ -6240,7 +6072,51 @@
               <w:rPr>
                 <w:sz w:val="18"/>
               </w:rPr>
-              <w:t>0.0050</w:t>
+              <w:t>0.0039</w:t>
+            </w:r>
+          </w:p>
+        </w:tc>
+      </w:tr>
+      <w:tr>
+        <w:tc>
+          <w:tcPr>
+            <w:tcW w:type="dxa" w:w="3081"/>
+            <w:vAlign w:val="center"/>
+          </w:tcPr>
+          <w:p>
+            <w:r>
+              <w:rPr>
+                <w:sz w:val="18"/>
+              </w:rPr>
+              <w:t>full_time_faculty_share</w:t>
+            </w:r>
+          </w:p>
+        </w:tc>
+        <w:tc>
+          <w:tcPr>
+            <w:tcW w:type="dxa" w:w="3081"/>
+            <w:vAlign w:val="center"/>
+          </w:tcPr>
+          <w:p>
+            <w:r>
+              <w:rPr>
+                <w:sz w:val="18"/>
+              </w:rPr>
+              <w:t>0.0065</w:t>
+            </w:r>
+          </w:p>
+        </w:tc>
+        <w:tc>
+          <w:tcPr>
+            <w:tcW w:type="dxa" w:w="3081"/>
+            <w:vAlign w:val="center"/>
+          </w:tcPr>
+          <w:p>
+            <w:r>
+              <w:rPr>
+                <w:sz w:val="18"/>
+              </w:rPr>
+              <w:t>0.0023</w:t>
             </w:r>
           </w:p>
         </w:tc>
@@ -6270,7 +6146,7 @@
               <w:rPr>
                 <w:sz w:val="18"/>
               </w:rPr>
-              <w:t>0.0115</w:t>
+              <w:t>0.0041</w:t>
             </w:r>
           </w:p>
         </w:tc>
@@ -6284,51 +6160,7 @@
               <w:rPr>
                 <w:sz w:val="18"/>
               </w:rPr>
-              <w:t>0.0018</w:t>
-            </w:r>
-          </w:p>
-        </w:tc>
-      </w:tr>
-      <w:tr>
-        <w:tc>
-          <w:tcPr>
-            <w:tcW w:type="dxa" w:w="3081"/>
-            <w:vAlign w:val="center"/>
-          </w:tcPr>
-          <w:p>
-            <w:r>
-              <w:rPr>
-                <w:sz w:val="18"/>
-              </w:rPr>
-              <w:t>federal_loan_share</w:t>
-            </w:r>
-          </w:p>
-        </w:tc>
-        <w:tc>
-          <w:tcPr>
-            <w:tcW w:type="dxa" w:w="3081"/>
-            <w:vAlign w:val="center"/>
-          </w:tcPr>
-          <w:p>
-            <w:r>
-              <w:rPr>
-                <w:sz w:val="18"/>
-              </w:rPr>
-              <w:t>0.0085</w:t>
-            </w:r>
-          </w:p>
-        </w:tc>
-        <w:tc>
-          <w:tcPr>
-            <w:tcW w:type="dxa" w:w="3081"/>
-            <w:vAlign w:val="center"/>
-          </w:tcPr>
-          <w:p>
-            <w:r>
-              <w:rPr>
-                <w:sz w:val="18"/>
-              </w:rPr>
-              <w:t>0.0026</w:t>
+              <w:t>0.0014</w:t>
             </w:r>
           </w:p>
         </w:tc>
@@ -6358,7 +6190,7 @@
               <w:rPr>
                 <w:sz w:val="18"/>
               </w:rPr>
-              <w:t>0.0070</w:t>
+              <w:t>0.0021</w:t>
             </w:r>
           </w:p>
         </w:tc>
@@ -6372,7 +6204,7 @@
               <w:rPr>
                 <w:sz w:val="18"/>
               </w:rPr>
-              <w:t>0.0021</w:t>
+              <w:t>0.0009</w:t>
             </w:r>
           </w:p>
         </w:tc>
@@ -6388,109 +6220,7 @@
               <w:rPr>
                 <w:sz w:val="18"/>
               </w:rPr>
-              <w:t>net_price</w:t>
-            </w:r>
-          </w:p>
-        </w:tc>
-        <w:tc>
-          <w:tcPr>
-            <w:tcW w:type="dxa" w:w="3081"/>
-            <w:vAlign w:val="center"/>
-          </w:tcPr>
-          <w:p>
-            <w:r>
-              <w:rPr>
-                <w:sz w:val="18"/>
-              </w:rPr>
-              <w:t>0.0017</w:t>
-            </w:r>
-          </w:p>
-        </w:tc>
-        <w:tc>
-          <w:tcPr>
-            <w:tcW w:type="dxa" w:w="3081"/>
-            <w:vAlign w:val="center"/>
-          </w:tcPr>
-          <w:p>
-            <w:r>
-              <w:rPr>
-                <w:sz w:val="18"/>
-              </w:rPr>
-              <w:t>0.0013</w:t>
-            </w:r>
-          </w:p>
-        </w:tc>
-      </w:tr>
-      <w:tr>
-        <w:tc>
-          <w:tcPr>
-            <w:tcW w:type="dxa" w:w="3081"/>
-            <w:vAlign w:val="center"/>
-          </w:tcPr>
-          <w:p>
-            <w:r>
-              <w:rPr>
-                <w:sz w:val="18"/>
-              </w:rPr>
-              <w:t>log_undergrad_enrollment</w:t>
-            </w:r>
-          </w:p>
-        </w:tc>
-        <w:tc>
-          <w:tcPr>
-            <w:tcW w:type="dxa" w:w="3081"/>
-            <w:vAlign w:val="center"/>
-          </w:tcPr>
-          <w:p>
-            <w:r>
-              <w:rPr>
-                <w:sz w:val="18"/>
-              </w:rPr>
-              <w:t>0.0008</w:t>
-            </w:r>
-          </w:p>
-        </w:tc>
-        <w:tc>
-          <w:tcPr>
-            <w:tcW w:type="dxa" w:w="3081"/>
-            <w:vAlign w:val="center"/>
-          </w:tcPr>
-          <w:p>
-            <w:r>
-              <w:rPr>
-                <w:sz w:val="18"/>
-              </w:rPr>
-              <w:t>0.0008</w:t>
-            </w:r>
-          </w:p>
-        </w:tc>
-      </w:tr>
-      <w:tr>
-        <w:tc>
-          <w:tcPr>
-            <w:tcW w:type="dxa" w:w="3081"/>
-            <w:vAlign w:val="center"/>
-          </w:tcPr>
-          <w:p>
-            <w:r>
-              <w:rPr>
-                <w:sz w:val="18"/>
-              </w:rPr>
-              <w:t>student_faculty_ratio</w:t>
-            </w:r>
-          </w:p>
-        </w:tc>
-        <w:tc>
-          <w:tcPr>
-            <w:tcW w:type="dxa" w:w="3081"/>
-            <w:vAlign w:val="center"/>
-          </w:tcPr>
-          <w:p>
-            <w:r>
-              <w:rPr>
-                <w:sz w:val="18"/>
-              </w:rPr>
-              <w:t>0.0003</w:t>
+              <w:t>average_faculty_salary</w:t>
             </w:r>
           </w:p>
         </w:tc>
@@ -6505,6 +6235,20 @@
                 <w:sz w:val="18"/>
               </w:rPr>
               <w:t>0.0007</w:t>
+            </w:r>
+          </w:p>
+        </w:tc>
+        <w:tc>
+          <w:tcPr>
+            <w:tcW w:type="dxa" w:w="3081"/>
+            <w:vAlign w:val="center"/>
+          </w:tcPr>
+          <w:p>
+            <w:r>
+              <w:rPr>
+                <w:sz w:val="18"/>
+              </w:rPr>
+              <w:t>0.0012</w:t>
             </w:r>
           </w:p>
         </w:tc>
@@ -6564,6 +6308,94 @@
               <w:rPr>
                 <w:sz w:val="18"/>
               </w:rPr>
+              <w:t>age_25_plus_share</w:t>
+            </w:r>
+          </w:p>
+        </w:tc>
+        <w:tc>
+          <w:tcPr>
+            <w:tcW w:type="dxa" w:w="3081"/>
+            <w:vAlign w:val="center"/>
+          </w:tcPr>
+          <w:p>
+            <w:r>
+              <w:rPr>
+                <w:sz w:val="18"/>
+              </w:rPr>
+              <w:t>0.0000</w:t>
+            </w:r>
+          </w:p>
+        </w:tc>
+        <w:tc>
+          <w:tcPr>
+            <w:tcW w:type="dxa" w:w="3081"/>
+            <w:vAlign w:val="center"/>
+          </w:tcPr>
+          <w:p>
+            <w:r>
+              <w:rPr>
+                <w:sz w:val="18"/>
+              </w:rPr>
+              <w:t>0.0000</w:t>
+            </w:r>
+          </w:p>
+        </w:tc>
+      </w:tr>
+      <w:tr>
+        <w:tc>
+          <w:tcPr>
+            <w:tcW w:type="dxa" w:w="3081"/>
+            <w:vAlign w:val="center"/>
+          </w:tcPr>
+          <w:p>
+            <w:r>
+              <w:rPr>
+                <w:sz w:val="18"/>
+              </w:rPr>
+              <w:t>student_faculty_ratio</w:t>
+            </w:r>
+          </w:p>
+        </w:tc>
+        <w:tc>
+          <w:tcPr>
+            <w:tcW w:type="dxa" w:w="3081"/>
+            <w:vAlign w:val="center"/>
+          </w:tcPr>
+          <w:p>
+            <w:r>
+              <w:rPr>
+                <w:sz w:val="18"/>
+              </w:rPr>
+              <w:t>-0.0000</w:t>
+            </w:r>
+          </w:p>
+        </w:tc>
+        <w:tc>
+          <w:tcPr>
+            <w:tcW w:type="dxa" w:w="3081"/>
+            <w:vAlign w:val="center"/>
+          </w:tcPr>
+          <w:p>
+            <w:r>
+              <w:rPr>
+                <w:sz w:val="18"/>
+              </w:rPr>
+              <w:t>0.0006</w:t>
+            </w:r>
+          </w:p>
+        </w:tc>
+      </w:tr>
+      <w:tr>
+        <w:tc>
+          <w:tcPr>
+            <w:tcW w:type="dxa" w:w="3081"/>
+            <w:vAlign w:val="center"/>
+          </w:tcPr>
+          <w:p>
+            <w:r>
+              <w:rPr>
+                <w:sz w:val="18"/>
+              </w:rPr>
               <w:t>distance_only</w:t>
             </w:r>
           </w:p>
@@ -6578,7 +6410,7 @@
               <w:rPr>
                 <w:sz w:val="18"/>
               </w:rPr>
-              <w:t>-0.0003</w:t>
+              <w:t>-0.0002</w:t>
             </w:r>
           </w:p>
         </w:tc>
@@ -6592,7 +6424,51 @@
               <w:rPr>
                 <w:sz w:val="18"/>
               </w:rPr>
-              <w:t>0.0004</w:t>
+              <w:t>0.0003</w:t>
+            </w:r>
+          </w:p>
+        </w:tc>
+      </w:tr>
+      <w:tr>
+        <w:tc>
+          <w:tcPr>
+            <w:tcW w:type="dxa" w:w="3081"/>
+            <w:vAlign w:val="center"/>
+          </w:tcPr>
+          <w:p>
+            <w:r>
+              <w:rPr>
+                <w:sz w:val="18"/>
+              </w:rPr>
+              <w:t>net_price</w:t>
+            </w:r>
+          </w:p>
+        </w:tc>
+        <w:tc>
+          <w:tcPr>
+            <w:tcW w:type="dxa" w:w="3081"/>
+            <w:vAlign w:val="center"/>
+          </w:tcPr>
+          <w:p>
+            <w:r>
+              <w:rPr>
+                <w:sz w:val="18"/>
+              </w:rPr>
+              <w:t>-0.0002</w:t>
+            </w:r>
+          </w:p>
+        </w:tc>
+        <w:tc>
+          <w:tcPr>
+            <w:tcW w:type="dxa" w:w="3081"/>
+            <w:vAlign w:val="center"/>
+          </w:tcPr>
+          <w:p>
+            <w:r>
+              <w:rPr>
+                <w:sz w:val="18"/>
+              </w:rPr>
+              <w:t>0.0010</w:t>
             </w:r>
           </w:p>
         </w:tc>
@@ -6616,7 +6492,100 @@
         <w:pStyle w:val="Heading2"/>
       </w:pPr>
       <w:r>
-        <w:t>7.13 Pseudocode</w:t>
+        <w:t>7.13 Điều rút ra và cách dùng dự báo</w:t>
+      </w:r>
+    </w:p>
+    <w:p>
+      <w:pPr>
+        <w:jc w:val="both"/>
+      </w:pPr>
+      <w:r>
+        <w:t>Trên 5,256 quan sát hiện tại, mô hình phân loại 1,672 nhóm (31.8%) có khả năng tỷ lệ hoàn thành dưới 40% tại cut-off 0,5. Có 1,219 nhóm (23.2%) ở mức rủi ro cao từ 70% trở lên.</w:t>
+      </w:r>
+    </w:p>
+    <w:p>
+      <w:pPr>
+        <w:jc w:val="both"/>
+      </w:pPr>
+      <w:r>
+        <w:t>So với mô hình chỉ dùng điều kiện nền tảng, việc bổ sung tỷ lệ tiếp tục học sau năm nhất làm Accuracy tăng 1.25%, Recall tăng 1.51% và ROC-AUC tăng 0.030. Đây là bằng chứng dự báo cho thấy việc quay lại học năm tiếp theo là mốc theo dõi thực tế quan trọng.</w:t>
+      </w:r>
+    </w:p>
+    <w:p>
+      <w:pPr>
+        <w:jc w:val="both"/>
+      </w:pPr>
+      <w:r>
+        <w:t>Dashboard kết hợp mức tiếp tục học với áp lực nguồn lực gồm nhiều sinh viên trên giảng viên, chi giảng dạy thấp và ít giảng viên toàn thời gian. Nhóm tiếp tục học thấp được ưu tiên kiểm tra; áp lực nguồn lực giúp khoanh vùng vấn đề cần xem sâu hơn. Kết quả không chứng minh tăng một nguồn lực sẽ trực tiếp tạo ra mức cải thiện cụ thể.</w:t>
+      </w:r>
+    </w:p>
+    <w:p>
+      <w:pPr>
+        <w:jc w:val="both"/>
+      </w:pPr>
+      <w:r>
+        <w:t>Hồ sơ cần ưu tiên cao nhất hiện tại là Cao đẳng 2 năm (Associate) · Công lập · Ngoại ô, gồm 153 quan sát, rủi ro dự báo trung bình 88.6% và tỷ lệ hoàn thành điển hình 29.7%.</w:t>
+      </w:r>
+    </w:p>
+    <w:p>
+      <w:pPr>
+        <w:jc w:val="both"/>
+      </w:pPr>
+      <w:r>
+        <w:t>Tỷ lệ tiếp tục học sau năm nhất điển hình của hồ sơ này là 64.3%, so với trung vị toàn dữ liệu 73.7%. Khi chỉ đưa retention về mức chung và giữ nguyên các yếu tố khác, xác suất dự báo giảm 8.4%. Đây là giải thích phản thực tế của mô hình, không phải bằng chứng retention gây ra đúng mức thay đổi đó.</w:t>
+      </w:r>
+    </w:p>
+    <w:p>
+      <w:pPr>
+        <w:jc w:val="both"/>
+      </w:pPr>
+      <w:r>
+        <w:t>Tỷ lệ giảng viên toàn thời gian của hồ sơ là 38.6%, so với mức chung 58.8%; kiểm tra tương tự cho thấy chênh dự báo 6.2%. Hai hướng ưu tiên là hỗ trợ việc quay lại sau năm nhất và rà soát mức độ sẵn có, tính liên tục của đội ngũ giảng dạy.</w:t>
+      </w:r>
+    </w:p>
+    <w:p>
+      <w:pPr>
+        <w:pStyle w:val="ListBullet"/>
+      </w:pPr>
+      <w:r>
+        <w:t>Theo dõi tỷ lệ quay lại học sau năm nhất như mốc cảnh báo sau năm đầu.</w:t>
+      </w:r>
+    </w:p>
+    <w:p>
+      <w:pPr>
+        <w:pStyle w:val="ListBullet"/>
+      </w:pPr>
+      <w:r>
+        <w:t>Ưu tiên phân tích nhóm vừa có khả năng tiếp tục học thấp vừa chịu áp lực nguồn lực.</w:t>
+      </w:r>
+    </w:p>
+    <w:p>
+      <w:pPr>
+        <w:pStyle w:val="ListBullet"/>
+      </w:pPr>
+      <w:r>
+        <w:t>Đối chiếu thêm hoàn cảnh tài chính trước khi đề xuất cố vấn học tập hoặc hỗ trợ môn học.</w:t>
+      </w:r>
+    </w:p>
+    <w:p>
+      <w:pPr>
+        <w:pStyle w:val="ListBullet"/>
+      </w:pPr>
+      <w:r>
+        <w:t>Không dùng xác suất để xếp hạng, xử phạt hoặc ra quyết định tự động về từng trường hay sinh viên.</w:t>
+      </w:r>
+    </w:p>
+    <w:p>
+      <w:r>
+        <w:br w:type="page"/>
+      </w:r>
+    </w:p>
+    <w:p>
+      <w:pPr>
+        <w:pStyle w:val="Heading2"/>
+      </w:pPr>
+      <w:r>
+        <w:t>7.14 Pseudocode</w:t>
       </w:r>
     </w:p>
     <w:p>
@@ -6771,7 +6740,7 @@
         <w:pStyle w:val="ListBullet"/>
       </w:pPr>
       <w:r>
-        <w:t>Mở trang 1, chỉ bản đồ và nêu khoảng cách địa lý.</w:t>
+        <w:t>Mở trang 1, chỉ bản đồ và giải thích chênh lệch kết quả giữa các bang.</w:t>
       </w:r>
     </w:p>
     <w:p>
@@ -6779,7 +6748,7 @@
         <w:pStyle w:val="ListBullet"/>
       </w:pPr>
       <w:r>
-        <w:t>Lọc một bang, đi sâu tới loại cơ sở và institution point map.</w:t>
+        <w:t>Lọc một bang, đi sâu tới loại hình, bậc đào tạo và khu vực sống.</w:t>
       </w:r>
     </w:p>
     <w:p>
@@ -6795,7 +6764,15 @@
         <w:pStyle w:val="ListBullet"/>
       </w:pPr>
       <w:r>
-        <w:t>Sang trang 3, giải thích Accuracy/Recall, confusion matrix và action list.</w:t>
+        <w:t>Sang trang 3, nêu mô hình dự báo completion dưới 40%, so sánh hai kịch bản và chỉ ma trận tiếp tục học–nguồn lực.</w:t>
+      </w:r>
+    </w:p>
+    <w:p>
+      <w:pPr>
+        <w:pStyle w:val="ListBullet"/>
+      </w:pPr>
+      <w:r>
+        <w:t>Kết luận bằng ba ưu tiên: theo dõi sau năm nhất, kiểm tra áp lực nguồn lực và đối chiếu khó khăn tài chính.</w:t>
       </w:r>
     </w:p>
     <w:p>

</xml_diff>

<commit_message>
Cập nhật insight động cho Dashboard trang 2
</commit_message>
<xml_diff>
--- a/report/TTDLTQ_report_draft.docx
+++ b/report/TTDLTQ_report_draft.docx
@@ -130,7 +130,7 @@
         <w:jc w:val="both"/>
       </w:pPr>
       <w:r>
-        <w:t>Hai kịch bản Logistic Regression được đánh giá trên năm 2022 chưa dùng để train. Mô hình điều kiện nền tảng đạt Accuracy 80.09%; mô hình bổ sung thông tin tiếp tục học sau năm nhất đạt Accuracy 81.34% và ROC-AUC 0.877. Cả hai vượt ngưỡng Accuracy 80%.</w:t>
+        <w:t>Hai kịch bản Logistic Regression được đánh giá trên năm 2022 chưa dùng để train. Mô hình điều kiện nền tảng đạt Accuracy 80.09%; mô hình bổ sung thông tin tiếp tục học sau năm nhất đạt Accuracy 81.30% và ROC-AUC 0.876. Cả hai vượt ngưỡng Accuracy 80%.</w:t>
       </w:r>
     </w:p>
     <w:p>
@@ -5376,7 +5376,7 @@
               <w:rPr>
                 <w:sz w:val="18"/>
               </w:rPr>
-              <w:t>81.34%</w:t>
+              <w:t>81.30%</w:t>
             </w:r>
           </w:p>
         </w:tc>
@@ -5420,7 +5420,7 @@
               <w:rPr>
                 <w:sz w:val="18"/>
               </w:rPr>
-              <w:t>79.86%</w:t>
+              <w:t>79.84%</w:t>
             </w:r>
           </w:p>
         </w:tc>
@@ -5508,7 +5508,7 @@
               <w:rPr>
                 <w:sz w:val="18"/>
               </w:rPr>
-              <w:t>64.51%</w:t>
+              <w:t>64.44%</w:t>
             </w:r>
           </w:p>
         </w:tc>
@@ -5552,7 +5552,7 @@
               <w:rPr>
                 <w:sz w:val="18"/>
               </w:rPr>
-              <w:t>69.97%</w:t>
+              <w:t>69.93%</w:t>
             </w:r>
           </w:p>
         </w:tc>
@@ -5596,7 +5596,7 @@
               <w:rPr>
                 <w:sz w:val="18"/>
               </w:rPr>
-              <w:t>0.877</w:t>
+              <w:t>0.876</w:t>
             </w:r>
           </w:p>
         </w:tc>
@@ -5970,7 +5970,7 @@
               <w:rPr>
                 <w:sz w:val="18"/>
               </w:rPr>
-              <w:t>0.0994</w:t>
+              <w:t>0.0988</w:t>
             </w:r>
           </w:p>
         </w:tc>
@@ -6014,7 +6014,7 @@
               <w:rPr>
                 <w:sz w:val="18"/>
               </w:rPr>
-              <w:t>0.0546</w:t>
+              <w:t>0.0543</w:t>
             </w:r>
           </w:p>
         </w:tc>
@@ -6028,7 +6028,7 @@
               <w:rPr>
                 <w:sz w:val="18"/>
               </w:rPr>
-              <w:t>0.0043</w:t>
+              <w:t>0.0044</w:t>
             </w:r>
           </w:p>
         </w:tc>
@@ -6058,7 +6058,7 @@
               <w:rPr>
                 <w:sz w:val="18"/>
               </w:rPr>
-              <w:t>0.0523</w:t>
+              <w:t>0.0517</w:t>
             </w:r>
           </w:p>
         </w:tc>
@@ -6072,7 +6072,7 @@
               <w:rPr>
                 <w:sz w:val="18"/>
               </w:rPr>
-              <w:t>0.0039</w:t>
+              <w:t>0.0040</w:t>
             </w:r>
           </w:p>
         </w:tc>
@@ -6102,7 +6102,7 @@
               <w:rPr>
                 <w:sz w:val="18"/>
               </w:rPr>
-              <w:t>0.0065</w:t>
+              <w:t>0.0058</w:t>
             </w:r>
           </w:p>
         </w:tc>
@@ -6116,7 +6116,7 @@
               <w:rPr>
                 <w:sz w:val="18"/>
               </w:rPr>
-              <w:t>0.0023</w:t>
+              <w:t>0.0024</w:t>
             </w:r>
           </w:p>
         </w:tc>
@@ -6146,7 +6146,7 @@
               <w:rPr>
                 <w:sz w:val="18"/>
               </w:rPr>
-              <w:t>0.0041</w:t>
+              <w:t>0.0040</w:t>
             </w:r>
           </w:p>
         </w:tc>
@@ -6190,7 +6190,7 @@
               <w:rPr>
                 <w:sz w:val="18"/>
               </w:rPr>
-              <w:t>0.0021</w:t>
+              <w:t>0.0019</w:t>
             </w:r>
           </w:p>
         </w:tc>
@@ -6234,7 +6234,7 @@
               <w:rPr>
                 <w:sz w:val="18"/>
               </w:rPr>
-              <w:t>0.0007</w:t>
+              <w:t>0.0004</w:t>
             </w:r>
           </w:p>
         </w:tc>
@@ -6248,7 +6248,7 @@
               <w:rPr>
                 <w:sz w:val="18"/>
               </w:rPr>
-              <w:t>0.0012</w:t>
+              <w:t>0.0013</w:t>
             </w:r>
           </w:p>
         </w:tc>
@@ -6352,50 +6352,6 @@
               <w:rPr>
                 <w:sz w:val="18"/>
               </w:rPr>
-              <w:t>student_faculty_ratio</w:t>
-            </w:r>
-          </w:p>
-        </w:tc>
-        <w:tc>
-          <w:tcPr>
-            <w:tcW w:type="dxa" w:w="3081"/>
-            <w:vAlign w:val="center"/>
-          </w:tcPr>
-          <w:p>
-            <w:r>
-              <w:rPr>
-                <w:sz w:val="18"/>
-              </w:rPr>
-              <w:t>-0.0000</w:t>
-            </w:r>
-          </w:p>
-        </w:tc>
-        <w:tc>
-          <w:tcPr>
-            <w:tcW w:type="dxa" w:w="3081"/>
-            <w:vAlign w:val="center"/>
-          </w:tcPr>
-          <w:p>
-            <w:r>
-              <w:rPr>
-                <w:sz w:val="18"/>
-              </w:rPr>
-              <w:t>0.0006</w:t>
-            </w:r>
-          </w:p>
-        </w:tc>
-      </w:tr>
-      <w:tr>
-        <w:tc>
-          <w:tcPr>
-            <w:tcW w:type="dxa" w:w="3081"/>
-            <w:vAlign w:val="center"/>
-          </w:tcPr>
-          <w:p>
-            <w:r>
-              <w:rPr>
-                <w:sz w:val="18"/>
-              </w:rPr>
               <w:t>distance_only</w:t>
             </w:r>
           </w:p>
@@ -6440,6 +6396,50 @@
               <w:rPr>
                 <w:sz w:val="18"/>
               </w:rPr>
+              <w:t>student_faculty_ratio</w:t>
+            </w:r>
+          </w:p>
+        </w:tc>
+        <w:tc>
+          <w:tcPr>
+            <w:tcW w:type="dxa" w:w="3081"/>
+            <w:vAlign w:val="center"/>
+          </w:tcPr>
+          <w:p>
+            <w:r>
+              <w:rPr>
+                <w:sz w:val="18"/>
+              </w:rPr>
+              <w:t>-0.0003</w:t>
+            </w:r>
+          </w:p>
+        </w:tc>
+        <w:tc>
+          <w:tcPr>
+            <w:tcW w:type="dxa" w:w="3081"/>
+            <w:vAlign w:val="center"/>
+          </w:tcPr>
+          <w:p>
+            <w:r>
+              <w:rPr>
+                <w:sz w:val="18"/>
+              </w:rPr>
+              <w:t>0.0006</w:t>
+            </w:r>
+          </w:p>
+        </w:tc>
+      </w:tr>
+      <w:tr>
+        <w:tc>
+          <w:tcPr>
+            <w:tcW w:type="dxa" w:w="3081"/>
+            <w:vAlign w:val="center"/>
+          </w:tcPr>
+          <w:p>
+            <w:r>
+              <w:rPr>
+                <w:sz w:val="18"/>
+              </w:rPr>
               <w:t>net_price</w:t>
             </w:r>
           </w:p>
@@ -6454,7 +6454,7 @@
               <w:rPr>
                 <w:sz w:val="18"/>
               </w:rPr>
-              <w:t>-0.0002</w:t>
+              <w:t>-0.0005</w:t>
             </w:r>
           </w:p>
         </w:tc>
@@ -6500,7 +6500,7 @@
         <w:jc w:val="both"/>
       </w:pPr>
       <w:r>
-        <w:t>Trên 5,256 quan sát hiện tại, mô hình phân loại 1,672 nhóm (31.8%) có khả năng tỷ lệ hoàn thành dưới 40% tại cut-off 0,5. Có 1,219 nhóm (23.2%) ở mức rủi ro cao từ 70% trở lên.</w:t>
+        <w:t>Trên 5,256 quan sát hiện tại, mô hình phân loại 1,672 nhóm (31.8%) có khả năng tỷ lệ hoàn thành dưới 40% tại cut-off 0,5. Có 1,222 nhóm (23.2%) ở mức rủi ro cao từ 70% trở lên.</w:t>
       </w:r>
     </w:p>
     <w:p>
@@ -6508,7 +6508,7 @@
         <w:jc w:val="both"/>
       </w:pPr>
       <w:r>
-        <w:t>So với mô hình chỉ dùng điều kiện nền tảng, việc bổ sung tỷ lệ tiếp tục học sau năm nhất làm Accuracy tăng 1.25%, Recall tăng 1.51% và ROC-AUC tăng 0.030. Đây là bằng chứng dự báo cho thấy việc quay lại học năm tiếp theo là mốc theo dõi thực tế quan trọng.</w:t>
+        <w:t>So với mô hình chỉ dùng điều kiện nền tảng, việc bổ sung tỷ lệ tiếp tục học sau năm nhất làm Accuracy tăng 1.21%, Recall tăng 1.51% và ROC-AUC tăng 0.030. Đây là bằng chứng dự báo cho thấy việc quay lại học năm tiếp theo là mốc theo dõi thực tế quan trọng.</w:t>
       </w:r>
     </w:p>
     <w:p>
@@ -6532,7 +6532,7 @@
         <w:jc w:val="both"/>
       </w:pPr>
       <w:r>
-        <w:t>Tỷ lệ tiếp tục học sau năm nhất điển hình của hồ sơ này là 64.3%, so với trung vị toàn dữ liệu 73.7%. Khi chỉ đưa retention về mức chung và giữ nguyên các yếu tố khác, xác suất dự báo giảm 8.4%. Đây là giải thích phản thực tế của mô hình, không phải bằng chứng retention gây ra đúng mức thay đổi đó.</w:t>
+        <w:t>Tỷ lệ tiếp tục học sau năm nhất điển hình của hồ sơ này là 64.3%, so với trung vị toàn dữ liệu 73.7%. Khi chỉ đưa retention về mức chung và giữ nguyên các yếu tố khác, xác suất dự báo giảm 8.3%. Đây là giải thích phản thực tế của mô hình, không phải bằng chứng retention gây ra đúng mức thay đổi đó.</w:t>
       </w:r>
     </w:p>
     <w:p>

</xml_diff>

<commit_message>
Cập nhật và đồng bộ 6 câu hỏi nghiên cứu
</commit_message>
<xml_diff>
--- a/report/TTDLTQ_report_draft.docx
+++ b/report/TTDLTQ_report_draft.docx
@@ -561,10 +561,18 @@
     </w:p>
     <w:p>
       <w:pPr>
+        <w:jc w:val="both"/>
+      </w:pPr>
+      <w:r>
+        <w:t>Trong các câu hỏi dưới đây, ‘kết quả’ được đo bằng tỷ lệ hoàn thành chương trình trong 150% thời gian chuẩn, tỷ lệ duy trì sau năm nhất hoặc tỷ lệ rút khỏi chương trình sau ba năm tùy câu hỏi. Đơn vị phân tích chính là cơ sở–năm; các mối liên hệ không được diễn giải thành nguyên nhân.</w:t>
+      </w:r>
+    </w:p>
+    <w:p>
+      <w:pPr>
         <w:pStyle w:val="ListBullet"/>
       </w:pPr>
       <w:r>
-        <w:t>RQ1: Kết quả khác nhau thế nào giữa bang, loại trường, bậc đào tạo, địa bàn và hình thức đào tạo?</w:t>
+        <w:t>RQ1: Tỷ lệ hoàn thành chương trình, duy trì sau năm nhất và rút khỏi chương trình khác nhau như thế nào giữa các bang, loại hình quản lý, bậc đào tạo chính, địa bàn và hình thức đào tạo từ xa?</w:t>
       </w:r>
     </w:p>
     <w:p>
@@ -572,7 +580,7 @@
         <w:pStyle w:val="ListBullet"/>
       </w:pPr>
       <w:r>
-        <w:t>RQ2: Chi phí, Pell Grant và vay liên bang liên quan thế nào với hoàn thành/rút khỏi?</w:t>
+        <w:t>RQ2: Chi phí ròng sau hỗ trợ, tỷ lệ sinh viên nhận Pell Grant và tỷ lệ sinh viên sử dụng khoản vay liên bang liên hệ theo hướng nào và mạnh đến đâu với tỷ lệ hoàn thành và rút khỏi chương trình?</w:t>
       </w:r>
     </w:p>
     <w:p>
@@ -580,7 +588,7 @@
         <w:pStyle w:val="ListBullet"/>
       </w:pPr>
       <w:r>
-        <w:t>RQ3: Quy mô, tỷ lệ sinh viên/giảng viên, tuyển chọn và địa bàn liên quan thế nào với kết quả?</w:t>
+        <w:t>RQ3: Tỷ lệ duy trì sau năm nhất, quy mô người học, số sinh viên trên một giảng viên, tỷ lệ giảng viên toàn thời gian, chi cho giảng dạy trên mỗi sinh viên và mức độ tuyển chọn liên hệ theo hướng nào với tỷ lệ hoàn thành?</w:t>
       </w:r>
     </w:p>
     <w:p>
@@ -588,7 +596,7 @@
         <w:pStyle w:val="ListBullet"/>
       </w:pPr>
       <w:r>
-        <w:t>RQ4: Nhóm nhận Pell và thế hệ đầu có khoảng cách kết quả thế nào?</w:t>
+        <w:t>RQ4: Tỷ lệ hoàn thành và rút khỏi chương trình sau ba năm chênh lệch bao nhiêu giữa nhóm nhận và không nhận Pell Grant, cũng như giữa nhóm thế hệ đầu và không phải thế hệ đầu học đại học trong các ô dữ liệu được công bố?</w:t>
       </w:r>
     </w:p>
     <w:p>
@@ -596,7 +604,7 @@
         <w:pStyle w:val="ListBullet"/>
       </w:pPr>
       <w:r>
-        <w:t>RQ5: Nhiều bất lợi xuất hiện đồng thời đi cùng kết quả ra sao?</w:t>
+        <w:t>RQ5: Tỷ lệ hoàn thành và tỷ trọng cơ sở có tỷ lệ hoàn thành dưới 40% thay đổi ra sao khi đồng thời xuất hiện từ 0 đến 4 điều kiện: tỷ lệ nhận Pell cao, chi phí ròng cao, số sinh viên trên một giảng viên cao và tỷ lệ duy trì sau năm nhất thấp? Mối liên hệ này có tăng đều theo số điều kiện hay có nhóm ngoại lệ cần phân tích sâu?</w:t>
       </w:r>
     </w:p>
     <w:p>
@@ -604,7 +612,7 @@
         <w:pStyle w:val="ListBullet"/>
       </w:pPr>
       <w:r>
-        <w:t>RQ6: Logistic Regression cảnh báo completion thấp chính xác đến đâu?</w:t>
+        <w:t>RQ6: Logistic Regression có nhận diện được các nhóm cơ sở–năm có tỷ lệ hoàn thành dưới 40% trên năm kiểm tra ngoài thời gian hay không, và việc bổ sung tỷ lệ duy trì sau năm nhất cải thiện Accuracy, Recall, Balanced Accuracy và ROC-AUC đến mức nào?</w:t>
       </w:r>
     </w:p>
     <w:p>

</xml_diff>